<commit_message>
New version fixed issue missing some formula
</commit_message>
<xml_diff>
--- a/chapter4_pilot.docx
+++ b/chapter4_pilot.docx
@@ -4,7 +4,7 @@
   <w:body>
     <w:p>
       <w:pPr>
-        <w:spacing w:after="200" w:before="200"/>
+        <w:spacing w:after="120" w:before="120"/>
         <w:jc w:val="center"/>
       </w:pPr>
       <w:r>
@@ -12,22 +12,22 @@
           <w:rFonts w:ascii="Arial" w:cs="Arial" w:eastAsia="Arial" w:hAnsi="Arial"/>
           <w:i/>
           <w:iCs/>
-          <w:color w:val="888888"/>
-          <w:sz w:val="20"/>
-          <w:szCs w:val="20"/>
-        </w:rPr>
-        <w:t xml:space="preserve">[Page 1 — Table of Contents]</w:t>
-      </w:r>
-    </w:p>
-    <w:p>
-      <w:pPr>
-        <w:spacing w:after="80" w:before="80"/>
+          <w:color w:val="AAAAAA"/>
+          <w:sz w:val="18"/>
+          <w:szCs w:val="18"/>
+        </w:rPr>
+        <w:t xml:space="preserve">[ Page 1 — Table of Contents ]</w:t>
+      </w:r>
+    </w:p>
+    <w:p>
+      <w:pPr>
+        <w:spacing w:after="100" w:before="100"/>
         <w:jc w:val="center"/>
       </w:pPr>
       <w:r>
         <w:drawing>
           <wp:inline distT="0" distB="0" distL="0" distR="0">
-            <wp:extent cx="47903130000" cy="68182121700"/>
+            <wp:extent cx="5029200" cy="7162800"/>
             <wp:effectExtent t="0" r="0" b="0" l="0"/>
             <wp:docPr id="1" name="" descr="" title=""/>
             <wp:cNvGraphicFramePr>
@@ -52,7 +52,7 @@
                   <pic:spPr bwMode="auto">
                     <a:xfrm>
                       <a:off x="0" y="0"/>
-                      <a:ext cx="47903130000" cy="68182121700"/>
+                      <a:ext cx="5029200" cy="7162800"/>
                     </a:xfrm>
                     <a:prstGeom prst="rect">
                       <a:avLst/>
@@ -72,7 +72,7 @@
     </w:p>
     <w:p>
       <w:pPr>
-        <w:spacing w:after="200" w:before="200"/>
+        <w:spacing w:after="120" w:before="120"/>
         <w:jc w:val="center"/>
       </w:pPr>
       <w:r>
@@ -80,22 +80,22 @@
           <w:rFonts w:ascii="Arial" w:cs="Arial" w:eastAsia="Arial" w:hAnsi="Arial"/>
           <w:i/>
           <w:iCs/>
-          <w:color w:val="888888"/>
-          <w:sz w:val="20"/>
-          <w:szCs w:val="20"/>
-        </w:rPr>
-        <w:t xml:space="preserve">[Page 2 — Chapter Title Page]</w:t>
-      </w:r>
-    </w:p>
-    <w:p>
-      <w:pPr>
-        <w:spacing w:after="80" w:before="80"/>
+          <w:color w:val="AAAAAA"/>
+          <w:sz w:val="18"/>
+          <w:szCs w:val="18"/>
+        </w:rPr>
+        <w:t xml:space="preserve">[ Page 2 — Chapter 4 Title Page ]</w:t>
+      </w:r>
+    </w:p>
+    <w:p>
+      <w:pPr>
+        <w:spacing w:after="100" w:before="100"/>
         <w:jc w:val="center"/>
       </w:pPr>
       <w:r>
         <w:drawing>
           <wp:inline distT="0" distB="0" distL="0" distR="0">
-            <wp:extent cx="47903130000" cy="68182121700"/>
+            <wp:extent cx="5029200" cy="7162800"/>
             <wp:effectExtent t="0" r="0" b="0" l="0"/>
             <wp:docPr id="1" name="" descr="" title=""/>
             <wp:cNvGraphicFramePr>
@@ -120,7 +120,7 @@
                   <pic:spPr bwMode="auto">
                     <a:xfrm>
                       <a:off x="0" y="0"/>
-                      <a:ext cx="47903130000" cy="68182121700"/>
+                      <a:ext cx="5029200" cy="7162800"/>
                     </a:xfrm>
                     <a:prstGeom prst="rect">
                       <a:avLst/>
@@ -140,13 +140,15 @@
     </w:p>
     <w:p>
       <w:pPr>
-        <w:spacing w:after="60" w:before="0"/>
-        <w:ind/>
-      </w:pPr>
-      <w:r>
-        <w:rPr>
-          <w:rFonts w:ascii="Arial" w:cs="Arial" w:eastAsia="Arial" w:hAnsi="Arial"/>
-          <w:color w:val="666666"/>
+        <w:pBdr>
+          <w:bottom w:val="single" w:color="AAAAAA" w:sz="4" w:space="4"/>
+        </w:pBdr>
+        <w:spacing w:after="80" w:before="0"/>
+      </w:pPr>
+      <w:r>
+        <w:rPr>
+          <w:rFonts w:ascii="SimSun" w:cs="SimSun" w:eastAsia="SimSun" w:hAnsi="SimSun"/>
+          <w:color w:val="888888"/>
           <w:sz w:val="18"/>
           <w:szCs w:val="18"/>
         </w:rPr>
@@ -155,12 +157,25 @@
       <w:r>
         <w:rPr>
           <w:rFonts w:ascii="SimSun" w:cs="SimSun" w:eastAsia="SimSun" w:hAnsi="SimSun"/>
-          <w:color w:val="666666"/>
           <w:sz w:val="18"/>
           <w:szCs w:val="18"/>
         </w:rPr>
-        <w:t xml:space="preserve">                                                                   玩转微积分</w:t>
-      </w:r>
+        <w:t xml:space="preserve">										</w:t>
+      </w:r>
+      <w:r>
+        <w:rPr>
+          <w:rFonts w:ascii="SimSun" w:cs="SimSun" w:eastAsia="SimSun" w:hAnsi="SimSun"/>
+          <w:color w:val="888888"/>
+          <w:sz w:val="18"/>
+          <w:szCs w:val="18"/>
+        </w:rPr>
+        <w:t xml:space="preserve">玩转微积分</w:t>
+      </w:r>
+    </w:p>
+    <w:p>
+      <w:pPr>
+        <w:spacing w:after="60" w:before="0"/>
+      </w:pPr>
     </w:p>
     <w:p>
       <w:pPr>
@@ -215,16 +230,16 @@
     <w:p>
       <w:pPr>
         <w:pStyle w:val="Heading2"/>
-        <w:spacing w:after="180" w:before="360"/>
-        <w:ind/>
+        <w:spacing w:after="200" w:before="400"/>
       </w:pPr>
       <w:r>
         <w:rPr>
           <w:rFonts w:ascii="SimHei" w:cs="SimHei" w:eastAsia="SimHei" w:hAnsi="SimHei"/>
           <w:b/>
           <w:bCs/>
-          <w:sz w:val="28"/>
-          <w:szCs w:val="28"/>
+          <w:color w:val="000000"/>
+          <w:sz w:val="30"/>
+          <w:szCs w:val="30"/>
         </w:rPr>
         <w:t xml:space="preserve">4.1  再论极限——罗必塔法则（L'Hôpital's Rule）</w:t>
       </w:r>
@@ -246,18 +261,18 @@
     </w:p>
     <w:p>
       <w:pPr>
-        <w:spacing w:after="40" w:before="0"/>
-      </w:pPr>
-    </w:p>
-    <w:p>
-      <w:pPr>
-        <w:spacing w:after="80" w:before="80"/>
+        <w:spacing w:after="60" w:before="0"/>
+      </w:pPr>
+    </w:p>
+    <w:p>
+      <w:pPr>
+        <w:spacing w:after="100" w:before="100"/>
         <w:jc w:val="center"/>
       </w:pPr>
       <w:r>
         <w:drawing>
           <wp:inline distT="0" distB="0" distL="0" distR="0">
-            <wp:extent cx="30483810000" cy="4412132400"/>
+            <wp:extent cx="2857500" cy="371475"/>
             <wp:effectExtent t="0" r="0" b="0" l="0"/>
             <wp:docPr id="1" name="" descr="" title=""/>
             <wp:cNvGraphicFramePr>
@@ -282,7 +297,7 @@
                   <pic:spPr bwMode="auto">
                     <a:xfrm>
                       <a:off x="0" y="0"/>
-                      <a:ext cx="30483810000" cy="4412132400"/>
+                      <a:ext cx="2857500" cy="371475"/>
                     </a:xfrm>
                     <a:prstGeom prst="rect">
                       <a:avLst/>
@@ -297,7 +312,7 @@
     </w:p>
     <w:p>
       <w:pPr>
-        <w:spacing w:after="40" w:before="0"/>
+        <w:spacing w:after="60" w:before="0"/>
       </w:pPr>
     </w:p>
     <w:p>
@@ -383,18 +398,18 @@
     </w:p>
     <w:p>
       <w:pPr>
-        <w:spacing w:after="40" w:before="0"/>
-      </w:pPr>
-    </w:p>
-    <w:p>
-      <w:pPr>
-        <w:spacing w:after="80" w:before="80"/>
+        <w:spacing w:after="60" w:before="0"/>
+      </w:pPr>
+    </w:p>
+    <w:p>
+      <w:pPr>
+        <w:spacing w:after="100" w:before="100"/>
         <w:jc w:val="center"/>
       </w:pPr>
       <w:r>
         <w:drawing>
           <wp:inline distT="0" distB="0" distL="0" distR="0">
-            <wp:extent cx="43548300000" cy="9384496725"/>
+            <wp:extent cx="4762500" cy="1000125"/>
             <wp:effectExtent t="0" r="0" b="0" l="0"/>
             <wp:docPr id="1" name="" descr="" title=""/>
             <wp:cNvGraphicFramePr>
@@ -419,7 +434,7 @@
                   <pic:spPr bwMode="auto">
                     <a:xfrm>
                       <a:off x="0" y="0"/>
-                      <a:ext cx="43548300000" cy="9384496725"/>
+                      <a:ext cx="4762500" cy="1000125"/>
                     </a:xfrm>
                     <a:prstGeom prst="rect">
                       <a:avLst/>
@@ -434,7 +449,7 @@
     </w:p>
     <w:p>
       <w:pPr>
-        <w:spacing w:after="40" w:before="0"/>
+        <w:spacing w:after="60" w:before="0"/>
       </w:pPr>
     </w:p>
     <w:p>
@@ -474,13 +489,15 @@
     </w:p>
     <w:p>
       <w:pPr>
-        <w:spacing w:after="60" w:before="0"/>
-        <w:ind/>
-      </w:pPr>
-      <w:r>
-        <w:rPr>
-          <w:rFonts w:ascii="SimSun" w:cs="SimSun" w:eastAsia="SimSun" w:hAnsi="SimSun"/>
-          <w:color w:val="666666"/>
+        <w:pBdr>
+          <w:bottom w:val="single" w:color="AAAAAA" w:sz="4" w:space="4"/>
+        </w:pBdr>
+        <w:spacing w:after="80" w:before="0"/>
+      </w:pPr>
+      <w:r>
+        <w:rPr>
+          <w:rFonts w:ascii="SimSun" w:cs="SimSun" w:eastAsia="SimSun" w:hAnsi="SimSun"/>
+          <w:color w:val="888888"/>
           <w:sz w:val="18"/>
           <w:szCs w:val="18"/>
         </w:rPr>
@@ -488,27 +505,40 @@
       </w:r>
       <w:r>
         <w:rPr>
-          <w:rFonts w:ascii="Arial" w:cs="Arial" w:eastAsia="Arial" w:hAnsi="Arial"/>
-          <w:color w:val="666666"/>
+          <w:rFonts w:ascii="SimSun" w:cs="SimSun" w:eastAsia="SimSun" w:hAnsi="SimSun"/>
           <w:sz w:val="18"/>
           <w:szCs w:val="18"/>
         </w:rPr>
-        <w:t xml:space="preserve">                                                                          85</w:t>
-      </w:r>
-    </w:p>
-    <w:p>
-      <w:pPr>
-        <w:spacing w:after="120" w:before="0" w:line="276"/>
-        <w:ind w:firstLine="440"/>
-        <w:jc w:val="both"/>
-      </w:pPr>
-      <w:r>
-        <w:rPr>
-          <w:rFonts w:ascii="SimSun" w:cs="SimSun" w:eastAsia="SimSun" w:hAnsi="SimSun"/>
-          <w:sz w:val="22"/>
-          <w:szCs w:val="22"/>
-        </w:rPr>
-        <w:t xml:space="preserve">首先，当 x →±∞ 时，该法则同样适用。</w:t>
+        <w:t xml:space="preserve">										</w:t>
+      </w:r>
+      <w:r>
+        <w:rPr>
+          <w:rFonts w:ascii="SimSun" w:cs="SimSun" w:eastAsia="SimSun" w:hAnsi="SimSun"/>
+          <w:color w:val="888888"/>
+          <w:sz w:val="18"/>
+          <w:szCs w:val="18"/>
+        </w:rPr>
+        <w:t xml:space="preserve">85</w:t>
+      </w:r>
+    </w:p>
+    <w:p>
+      <w:pPr>
+        <w:spacing w:after="60" w:before="0"/>
+      </w:pPr>
+    </w:p>
+    <w:p>
+      <w:pPr>
+        <w:spacing w:after="120" w:before="0" w:line="276"/>
+        <w:ind w:firstLine="440"/>
+        <w:jc w:val="both"/>
+      </w:pPr>
+      <w:r>
+        <w:rPr>
+          <w:rFonts w:ascii="SimSun" w:cs="SimSun" w:eastAsia="SimSun" w:hAnsi="SimSun"/>
+          <w:sz w:val="22"/>
+          <w:szCs w:val="22"/>
+        </w:rPr>
+        <w:t xml:space="preserve">首先，当 x → ±∞ 时，该法则同样适用。</w:t>
       </w:r>
     </w:p>
     <w:p>
@@ -574,21 +604,22 @@
           <w:sz w:val="22"/>
           <w:szCs w:val="22"/>
         </w:rPr>
-        <w:t xml:space="preserve">例 4-1）</w:t>
-      </w:r>
-      <w:r>
-        <w:rPr>
-          <w:rFonts w:ascii="SimSun" w:cs="SimSun" w:eastAsia="SimSun" w:hAnsi="SimSun"/>
-          <w:sz w:val="22"/>
-          <w:szCs w:val="22"/>
-        </w:rPr>
-        <w:t xml:space="preserve">  求 lim (ln x)/(x - 1)。 （x → 1）</w:t>
-      </w:r>
-    </w:p>
-    <w:p>
-      <w:pPr>
-        <w:spacing w:after="120" w:before="0" w:line="276"/>
-        <w:ind w:firstLine="440"/>
+        <w:t xml:space="preserve">例 4-1）  </w:t>
+      </w:r>
+      <w:r>
+        <w:rPr>
+          <w:rFonts w:ascii="SimSun" w:cs="SimSun" w:eastAsia="SimSun" w:hAnsi="SimSun"/>
+          <w:sz w:val="22"/>
+          <w:szCs w:val="22"/>
+        </w:rPr>
+        <w:t xml:space="preserve">求 lim（ln x）/（x − 1）。（x → 1）</w:t>
+      </w:r>
+    </w:p>
+    <w:p>
+      <w:pPr>
+        <w:spacing w:after="120" w:before="0" w:line="276"/>
+        <w:ind w:firstLine="440"/>
+        <w:jc w:val="both"/>
       </w:pPr>
       <w:r>
         <w:rPr>
@@ -601,18 +632,18 @@
     </w:p>
     <w:p>
       <w:pPr>
-        <w:spacing w:after="40" w:before="0"/>
-      </w:pPr>
-    </w:p>
-    <w:p>
-      <w:pPr>
-        <w:spacing w:after="80" w:before="80"/>
+        <w:spacing w:after="60" w:before="0"/>
+      </w:pPr>
+    </w:p>
+    <w:p>
+      <w:pPr>
+        <w:spacing w:after="100" w:before="100"/>
         <w:jc w:val="center"/>
       </w:pPr>
       <w:r>
         <w:drawing>
           <wp:inline distT="0" distB="0" distL="0" distR="0">
-            <wp:extent cx="43548300000" cy="5318874300"/>
+            <wp:extent cx="4953000" cy="571500"/>
             <wp:effectExtent t="0" r="0" b="0" l="0"/>
             <wp:docPr id="1" name="" descr="" title=""/>
             <wp:cNvGraphicFramePr>
@@ -637,7 +668,7 @@
                   <pic:spPr bwMode="auto">
                     <a:xfrm>
                       <a:off x="0" y="0"/>
-                      <a:ext cx="43548300000" cy="5318874300"/>
+                      <a:ext cx="4953000" cy="571500"/>
                     </a:xfrm>
                     <a:prstGeom prst="rect">
                       <a:avLst/>
@@ -668,21 +699,22 @@
           <w:sz w:val="22"/>
           <w:szCs w:val="22"/>
         </w:rPr>
-        <w:t xml:space="preserve">例 4-2）</w:t>
-      </w:r>
-      <w:r>
-        <w:rPr>
-          <w:rFonts w:ascii="SimSun" w:cs="SimSun" w:eastAsia="SimSun" w:hAnsi="SimSun"/>
-          <w:sz w:val="22"/>
-          <w:szCs w:val="22"/>
-        </w:rPr>
-        <w:t xml:space="preserve">  求 lim 2ˣ / 8x。 （x → ∞）</w:t>
-      </w:r>
-    </w:p>
-    <w:p>
-      <w:pPr>
-        <w:spacing w:after="120" w:before="0" w:line="276"/>
-        <w:ind w:firstLine="440"/>
+        <w:t xml:space="preserve">例 4-2）  </w:t>
+      </w:r>
+      <w:r>
+        <w:rPr>
+          <w:rFonts w:ascii="SimSun" w:cs="SimSun" w:eastAsia="SimSun" w:hAnsi="SimSun"/>
+          <w:sz w:val="22"/>
+          <w:szCs w:val="22"/>
+        </w:rPr>
+        <w:t xml:space="preserve">求 lim 2ˣ / 8x。（x → ∞）</w:t>
+      </w:r>
+    </w:p>
+    <w:p>
+      <w:pPr>
+        <w:spacing w:after="120" w:before="0" w:line="276"/>
+        <w:ind w:firstLine="440"/>
+        <w:jc w:val="both"/>
       </w:pPr>
       <w:r>
         <w:rPr>
@@ -695,18 +727,18 @@
     </w:p>
     <w:p>
       <w:pPr>
-        <w:spacing w:after="40" w:before="0"/>
-      </w:pPr>
-    </w:p>
-    <w:p>
-      <w:pPr>
-        <w:spacing w:after="80" w:before="80"/>
+        <w:spacing w:after="60" w:before="0"/>
+      </w:pPr>
+    </w:p>
+    <w:p>
+      <w:pPr>
+        <w:spacing w:after="100" w:before="100"/>
         <w:jc w:val="center"/>
       </w:pPr>
       <w:r>
         <w:drawing>
           <wp:inline distT="0" distB="0" distL="0" distR="0">
-            <wp:extent cx="43548300000" cy="4487799000"/>
+            <wp:extent cx="4953000" cy="466725"/>
             <wp:effectExtent t="0" r="0" b="0" l="0"/>
             <wp:docPr id="1" name="" descr="" title=""/>
             <wp:cNvGraphicFramePr>
@@ -731,7 +763,7 @@
                   <pic:spPr bwMode="auto">
                     <a:xfrm>
                       <a:off x="0" y="0"/>
-                      <a:ext cx="43548300000" cy="4487799000"/>
+                      <a:ext cx="4953000" cy="466725"/>
                     </a:xfrm>
                     <a:prstGeom prst="rect">
                       <a:avLst/>
@@ -782,21 +814,22 @@
           <w:sz w:val="22"/>
           <w:szCs w:val="22"/>
         </w:rPr>
-        <w:t xml:space="preserve">例 4-3）</w:t>
-      </w:r>
-      <w:r>
-        <w:rPr>
-          <w:rFonts w:ascii="SimSun" w:cs="SimSun" w:eastAsia="SimSun" w:hAnsi="SimSun"/>
-          <w:sz w:val="22"/>
-          <w:szCs w:val="22"/>
-        </w:rPr>
-        <w:t xml:space="preserve">  求 lim 3ˣ / x³。 （x → ∞）</w:t>
-      </w:r>
-    </w:p>
-    <w:p>
-      <w:pPr>
-        <w:spacing w:after="120" w:before="0" w:line="276"/>
-        <w:ind w:firstLine="440"/>
+        <w:t xml:space="preserve">例 4-3）  </w:t>
+      </w:r>
+      <w:r>
+        <w:rPr>
+          <w:rFonts w:ascii="SimSun" w:cs="SimSun" w:eastAsia="SimSun" w:hAnsi="SimSun"/>
+          <w:sz w:val="22"/>
+          <w:szCs w:val="22"/>
+        </w:rPr>
+        <w:t xml:space="preserve">求 lim 3ˣ / x³。（x → ∞）</w:t>
+      </w:r>
+    </w:p>
+    <w:p>
+      <w:pPr>
+        <w:spacing w:after="120" w:before="0" w:line="276"/>
+        <w:ind w:firstLine="440"/>
+        <w:jc w:val="both"/>
       </w:pPr>
       <w:r>
         <w:rPr>
@@ -809,18 +842,18 @@
     </w:p>
     <w:p>
       <w:pPr>
-        <w:spacing w:after="40" w:before="0"/>
-      </w:pPr>
-    </w:p>
-    <w:p>
-      <w:pPr>
-        <w:spacing w:after="80" w:before="80"/>
+        <w:spacing w:after="60" w:before="0"/>
+      </w:pPr>
+    </w:p>
+    <w:p>
+      <w:pPr>
+        <w:spacing w:after="100" w:before="100"/>
         <w:jc w:val="center"/>
       </w:pPr>
       <w:r>
         <w:drawing>
           <wp:inline distT="0" distB="0" distL="0" distR="0">
-            <wp:extent cx="43548300000" cy="8233267125"/>
+            <wp:extent cx="5524500" cy="409575"/>
             <wp:effectExtent t="0" r="0" b="0" l="0"/>
             <wp:docPr id="1" name="" descr="" title=""/>
             <wp:cNvGraphicFramePr>
@@ -845,7 +878,7 @@
                   <pic:spPr bwMode="auto">
                     <a:xfrm>
                       <a:off x="0" y="0"/>
-                      <a:ext cx="43548300000" cy="8233267125"/>
+                      <a:ext cx="5524500" cy="409575"/>
                     </a:xfrm>
                     <a:prstGeom prst="rect">
                       <a:avLst/>
@@ -860,82 +893,13 @@
     </w:p>
     <w:p>
       <w:pPr>
-        <w:spacing w:after="40" w:before="0"/>
-      </w:pPr>
-    </w:p>
-    <w:p>
-      <w:pPr>
-        <w:spacing w:after="120" w:before="0" w:line="276"/>
-        <w:ind w:firstLine="440"/>
-        <w:jc w:val="both"/>
-      </w:pPr>
-      <w:r>
-        <w:rPr>
-          <w:rFonts w:ascii="SimSun" w:cs="SimSun" w:eastAsia="SimSun" w:hAnsi="SimSun"/>
-          <w:sz w:val="22"/>
-          <w:szCs w:val="22"/>
-        </w:rPr>
-        <w:t xml:space="preserve">由本题的解题过程可知，即使分母不是 x³，而是 x¹⁰⁰ 或者更高次方，也不会改变极限的结果。同样，只要分子上 aˣ 中的 a &gt; 1，结果不会变，都是 ∞。</w:t>
-      </w:r>
-    </w:p>
-    <w:p>
-      <w:pPr>
-        <w:spacing w:after="120" w:before="0" w:line="276"/>
-        <w:ind w:firstLine="440"/>
-        <w:jc w:val="both"/>
-      </w:pPr>
-      <w:r>
-        <w:rPr>
-          <w:rFonts w:ascii="SimSun" w:cs="SimSun" w:eastAsia="SimSun" w:hAnsi="SimSun"/>
-          <w:sz w:val="22"/>
-          <w:szCs w:val="22"/>
-        </w:rPr>
-        <w:t xml:space="preserve">这也就印证了我们前面说过的：aˣ 型的 ∞ 最厉害，跟 xⁿ 型的 ∞ 没有可比性。我们再看一下 xⁿ 型的 ∞ 遇上 log_b x 型的 ∞，会发生什么。</w:t>
-      </w:r>
-    </w:p>
-    <w:p>
-      <w:pPr>
-        <w:spacing w:after="80" w:before="0"/>
-      </w:pPr>
-    </w:p>
-    <w:p>
-      <w:pPr>
-        <w:spacing w:after="120" w:before="0" w:line="276"/>
-        <w:ind w:firstLine="440"/>
-      </w:pPr>
-      <w:r>
-        <w:rPr>
-          <w:rFonts w:ascii="SimSun" w:cs="SimSun" w:eastAsia="SimSun" w:hAnsi="SimSun"/>
-          <w:b/>
-          <w:bCs/>
-          <w:sz w:val="22"/>
-          <w:szCs w:val="22"/>
-        </w:rPr>
-        <w:t xml:space="preserve">例 4-4）</w:t>
-      </w:r>
-      <w:r>
-        <w:rPr>
-          <w:rFonts w:ascii="SimSun" w:cs="SimSun" w:eastAsia="SimSun" w:hAnsi="SimSun"/>
-          <w:sz w:val="22"/>
-          <w:szCs w:val="22"/>
-        </w:rPr>
-        <w:t xml:space="preserve">  </w:t>
-      </w:r>
-    </w:p>
-    <w:p>
-      <w:pPr>
-        <w:spacing w:after="40" w:before="0"/>
-      </w:pPr>
-    </w:p>
-    <w:p>
-      <w:pPr>
-        <w:spacing w:after="80" w:before="80"/>
+        <w:spacing w:after="100" w:before="100"/>
         <w:jc w:val="center"/>
       </w:pPr>
       <w:r>
         <w:drawing>
           <wp:inline distT="0" distB="0" distL="0" distR="0">
-            <wp:extent cx="43548300000" cy="10252748100"/>
+            <wp:extent cx="5524500" cy="333375"/>
             <wp:effectExtent t="0" r="0" b="0" l="0"/>
             <wp:docPr id="1" name="" descr="" title=""/>
             <wp:cNvGraphicFramePr>
@@ -960,7 +924,7 @@
                   <pic:spPr bwMode="auto">
                     <a:xfrm>
                       <a:off x="0" y="0"/>
-                      <a:ext cx="43548300000" cy="10252748100"/>
+                      <a:ext cx="5524500" cy="333375"/>
                     </a:xfrm>
                     <a:prstGeom prst="rect">
                       <a:avLst/>
@@ -975,92 +939,82 @@
     </w:p>
     <w:p>
       <w:pPr>
+        <w:spacing w:after="60" w:before="0"/>
+      </w:pPr>
+    </w:p>
+    <w:p>
+      <w:pPr>
+        <w:spacing w:after="120" w:before="0" w:line="276"/>
+        <w:ind w:firstLine="440"/>
+        <w:jc w:val="both"/>
+      </w:pPr>
+      <w:r>
+        <w:rPr>
+          <w:rFonts w:ascii="SimSun" w:cs="SimSun" w:eastAsia="SimSun" w:hAnsi="SimSun"/>
+          <w:sz w:val="22"/>
+          <w:szCs w:val="22"/>
+        </w:rPr>
+        <w:t xml:space="preserve">由本题的解题过程可知，即使分母不是 x³，而是 x¹⁰⁰ 或者更高次方，也不会改变极限的结果。同样，只要分子上 aˣ 中的 a &gt; 1，结果不会变，都是 ∞。</w:t>
+      </w:r>
+    </w:p>
+    <w:p>
+      <w:pPr>
+        <w:spacing w:after="120" w:before="0" w:line="276"/>
+        <w:ind w:firstLine="440"/>
+        <w:jc w:val="both"/>
+      </w:pPr>
+      <w:r>
+        <w:rPr>
+          <w:rFonts w:ascii="SimSun" w:cs="SimSun" w:eastAsia="SimSun" w:hAnsi="SimSun"/>
+          <w:sz w:val="22"/>
+          <w:szCs w:val="22"/>
+        </w:rPr>
+        <w:t xml:space="preserve">这也就印证了我们前面说过的：aˣ 型的 ∞ 最厉害，跟 xⁿ 型的 ∞ 没有可比性。我们再看一下 xⁿ 型的 ∞ 遇上 log_b x 型的 ∞，会发生什么。</w:t>
+      </w:r>
+    </w:p>
+    <w:p>
+      <w:pPr>
         <w:spacing w:after="80" w:before="0"/>
       </w:pPr>
     </w:p>
     <w:p>
       <w:pPr>
-        <w:spacing w:after="60" w:before="120"/>
-        <w:ind/>
-      </w:pPr>
-      <w:r>
-        <w:rPr>
-          <w:rFonts w:ascii="Arial" w:cs="Arial" w:eastAsia="Arial" w:hAnsi="Arial"/>
-          <w:color w:val="666666"/>
-          <w:sz w:val="18"/>
-          <w:szCs w:val="18"/>
-        </w:rPr>
-        <w:t xml:space="preserve">86</w:t>
-      </w:r>
-      <w:r>
-        <w:rPr>
-          <w:rFonts w:ascii="SimSun" w:cs="SimSun" w:eastAsia="SimSun" w:hAnsi="SimSun"/>
-          <w:color w:val="666666"/>
-          <w:sz w:val="18"/>
-          <w:szCs w:val="18"/>
-        </w:rPr>
-        <w:t xml:space="preserve">                                                                   玩转微积分</w:t>
-      </w:r>
-    </w:p>
-    <w:p>
-      <w:pPr>
-        <w:spacing w:after="120" w:before="0" w:line="276"/>
-        <w:ind w:firstLine="440"/>
-        <w:jc w:val="both"/>
-      </w:pPr>
-      <w:r>
-        <w:rPr>
-          <w:rFonts w:ascii="SimSun" w:cs="SimSun" w:eastAsia="SimSun" w:hAnsi="SimSun"/>
-          <w:sz w:val="22"/>
-          <w:szCs w:val="22"/>
-        </w:rPr>
-        <w:t xml:space="preserve">这一次，xⁿ 型的 ∞ 与 log_b x 型的 ∞ 比较结果同样是 ∞！</w:t>
-      </w:r>
-    </w:p>
-    <w:p>
-      <w:pPr>
-        <w:spacing w:after="120" w:before="0" w:line="276"/>
-        <w:ind w:firstLine="440"/>
-        <w:jc w:val="both"/>
-      </w:pPr>
-      <w:r>
-        <w:rPr>
-          <w:rFonts w:ascii="SimSun" w:cs="SimSun" w:eastAsia="SimSun" w:hAnsi="SimSun"/>
-          <w:sz w:val="22"/>
-          <w:szCs w:val="22"/>
-        </w:rPr>
-        <w:t xml:space="preserve">再重申一次，如果碰到 ∞/∞ 型的极限问题，分子分母只留下级别最高的 ∞ "值班"即可，结果不会错。</w:t>
-      </w:r>
-    </w:p>
-    <w:p>
-      <w:pPr>
-        <w:spacing w:after="120" w:before="0" w:line="276"/>
-        <w:ind w:firstLine="440"/>
-        <w:jc w:val="both"/>
-      </w:pPr>
-      <w:r>
-        <w:rPr>
-          <w:rFonts w:ascii="SimSun" w:cs="SimSun" w:eastAsia="SimSun" w:hAnsi="SimSun"/>
-          <w:sz w:val="22"/>
-          <w:szCs w:val="22"/>
-        </w:rPr>
-        <w:t xml:space="preserve">有了罗必塔法则，再来看第二章要求你记住的两个著名极限，将会非常直观：</w:t>
-      </w:r>
-    </w:p>
-    <w:p>
-      <w:pPr>
-        <w:spacing w:after="40" w:before="0"/>
-      </w:pPr>
-    </w:p>
-    <w:p>
-      <w:pPr>
-        <w:spacing w:after="80" w:before="80"/>
+        <w:spacing w:after="120" w:before="0" w:line="276"/>
+        <w:ind w:firstLine="440"/>
+      </w:pPr>
+      <w:r>
+        <w:rPr>
+          <w:rFonts w:ascii="SimSun" w:cs="SimSun" w:eastAsia="SimSun" w:hAnsi="SimSun"/>
+          <w:b/>
+          <w:bCs/>
+          <w:sz w:val="22"/>
+          <w:szCs w:val="22"/>
+        </w:rPr>
+        <w:t xml:space="preserve">例 4-4）  </w:t>
+      </w:r>
+      <w:r>
+        <w:rPr>
+          <w:rFonts w:ascii="SimSun" w:cs="SimSun" w:eastAsia="SimSun" w:hAnsi="SimSun"/>
+          <w:sz w:val="22"/>
+          <w:szCs w:val="22"/>
+        </w:rPr>
+        <w:t xml:space="preserve"/>
+      </w:r>
+    </w:p>
+    <w:p>
+      <w:pPr>
+        <w:spacing w:after="60" w:before="0"/>
+      </w:pPr>
+    </w:p>
+    <w:p>
+      <w:pPr>
+        <w:spacing w:after="100" w:before="100"/>
         <w:jc w:val="center"/>
       </w:pPr>
       <w:r>
         <w:drawing>
           <wp:inline distT="0" distB="0" distL="0" distR="0">
-            <wp:extent cx="30483810000" cy="6937695675"/>
+            <wp:extent cx="5524500" cy="1219200"/>
             <wp:effectExtent t="0" r="0" b="0" l="0"/>
             <wp:docPr id="1" name="" descr="" title=""/>
             <wp:cNvGraphicFramePr>
@@ -1085,7 +1039,7 @@
                   <pic:spPr bwMode="auto">
                     <a:xfrm>
                       <a:off x="0" y="0"/>
-                      <a:ext cx="30483810000" cy="6937695675"/>
+                      <a:ext cx="5524500" cy="1219200"/>
                     </a:xfrm>
                     <a:prstGeom prst="rect">
                       <a:avLst/>
@@ -1100,7 +1054,147 @@
     </w:p>
     <w:p>
       <w:pPr>
-        <w:spacing w:after="40" w:before="0"/>
+        <w:spacing w:after="80" w:before="0"/>
+      </w:pPr>
+    </w:p>
+    <w:p>
+      <w:pPr>
+        <w:pBdr>
+          <w:bottom w:val="single" w:color="AAAAAA" w:sz="4" w:space="4"/>
+        </w:pBdr>
+        <w:spacing w:after="80" w:before="0"/>
+      </w:pPr>
+      <w:r>
+        <w:rPr>
+          <w:rFonts w:ascii="SimSun" w:cs="SimSun" w:eastAsia="SimSun" w:hAnsi="SimSun"/>
+          <w:color w:val="888888"/>
+          <w:sz w:val="18"/>
+          <w:szCs w:val="18"/>
+        </w:rPr>
+        <w:t xml:space="preserve">86</w:t>
+      </w:r>
+      <w:r>
+        <w:rPr>
+          <w:rFonts w:ascii="SimSun" w:cs="SimSun" w:eastAsia="SimSun" w:hAnsi="SimSun"/>
+          <w:sz w:val="18"/>
+          <w:szCs w:val="18"/>
+        </w:rPr>
+        <w:t xml:space="preserve">										</w:t>
+      </w:r>
+      <w:r>
+        <w:rPr>
+          <w:rFonts w:ascii="SimSun" w:cs="SimSun" w:eastAsia="SimSun" w:hAnsi="SimSun"/>
+          <w:color w:val="888888"/>
+          <w:sz w:val="18"/>
+          <w:szCs w:val="18"/>
+        </w:rPr>
+        <w:t xml:space="preserve">玩转微积分</w:t>
+      </w:r>
+    </w:p>
+    <w:p>
+      <w:pPr>
+        <w:spacing w:after="60" w:before="0"/>
+      </w:pPr>
+    </w:p>
+    <w:p>
+      <w:pPr>
+        <w:spacing w:after="120" w:before="0" w:line="276"/>
+        <w:ind w:firstLine="440"/>
+        <w:jc w:val="both"/>
+      </w:pPr>
+      <w:r>
+        <w:rPr>
+          <w:rFonts w:ascii="SimSun" w:cs="SimSun" w:eastAsia="SimSun" w:hAnsi="SimSun"/>
+          <w:sz w:val="22"/>
+          <w:szCs w:val="22"/>
+        </w:rPr>
+        <w:t xml:space="preserve">这一次，xⁿ 型的 ∞ 与 log_b x 型的 ∞ 比较结果同样是 ∞！</w:t>
+      </w:r>
+    </w:p>
+    <w:p>
+      <w:pPr>
+        <w:spacing w:after="120" w:before="0" w:line="276"/>
+        <w:ind w:firstLine="440"/>
+        <w:jc w:val="both"/>
+      </w:pPr>
+      <w:r>
+        <w:rPr>
+          <w:rFonts w:ascii="SimSun" w:cs="SimSun" w:eastAsia="SimSun" w:hAnsi="SimSun"/>
+          <w:sz w:val="22"/>
+          <w:szCs w:val="22"/>
+        </w:rPr>
+        <w:t xml:space="preserve">再重申一次，如果碰到 ∞/∞ 型的极限问题，分子分母只留下级别最高的 ∞"值班"即可，结果不会错。</w:t>
+      </w:r>
+    </w:p>
+    <w:p>
+      <w:pPr>
+        <w:spacing w:after="120" w:before="0" w:line="276"/>
+        <w:ind w:firstLine="440"/>
+        <w:jc w:val="both"/>
+      </w:pPr>
+      <w:r>
+        <w:rPr>
+          <w:rFonts w:ascii="SimSun" w:cs="SimSun" w:eastAsia="SimSun" w:hAnsi="SimSun"/>
+          <w:sz w:val="22"/>
+          <w:szCs w:val="22"/>
+        </w:rPr>
+        <w:t xml:space="preserve">有了罗必塔法则，再来看第二章要求你记住的两个著名极限，将会非常直观：</w:t>
+      </w:r>
+    </w:p>
+    <w:p>
+      <w:pPr>
+        <w:spacing w:after="60" w:before="0"/>
+      </w:pPr>
+    </w:p>
+    <w:p>
+      <w:pPr>
+        <w:spacing w:after="100" w:before="100"/>
+        <w:jc w:val="center"/>
+      </w:pPr>
+      <w:r>
+        <w:drawing>
+          <wp:inline distT="0" distB="0" distL="0" distR="0">
+            <wp:extent cx="3048000" cy="666750"/>
+            <wp:effectExtent t="0" r="0" b="0" l="0"/>
+            <wp:docPr id="1" name="" descr="" title=""/>
+            <wp:cNvGraphicFramePr>
+              <a:graphicFrameLocks xmlns:a="http://schemas.openxmlformats.org/drawingml/2006/main" noChangeAspect="1"/>
+            </wp:cNvGraphicFramePr>
+            <a:graphic xmlns:a="http://schemas.openxmlformats.org/drawingml/2006/main">
+              <a:graphicData uri="http://schemas.openxmlformats.org/drawingml/2006/picture">
+                <pic:pic xmlns:pic="http://schemas.openxmlformats.org/drawingml/2006/picture">
+                  <pic:nvPicPr>
+                    <pic:cNvPr id="0" name="" descr=""/>
+                    <pic:cNvPicPr>
+                      <a:picLocks noChangeAspect="1" noChangeArrowheads="1"/>
+                    </pic:cNvPicPr>
+                  </pic:nvPicPr>
+                  <pic:blipFill>
+                    <a:blip r:embed="rId16" cstate="none"/>
+                    <a:srcRect/>
+                    <a:stretch>
+                      <a:fillRect/>
+                    </a:stretch>
+                  </pic:blipFill>
+                  <pic:spPr bwMode="auto">
+                    <a:xfrm>
+                      <a:off x="0" y="0"/>
+                      <a:ext cx="3048000" cy="666750"/>
+                    </a:xfrm>
+                    <a:prstGeom prst="rect">
+                      <a:avLst/>
+                    </a:prstGeom>
+                  </pic:spPr>
+                </pic:pic>
+              </a:graphicData>
+            </a:graphic>
+          </wp:inline>
+        </w:drawing>
+      </w:r>
+    </w:p>
+    <w:p>
+      <w:pPr>
+        <w:spacing w:after="60" w:before="0"/>
       </w:pPr>
     </w:p>
     <w:p>
@@ -1141,16 +1235,16 @@
     <w:p>
       <w:pPr>
         <w:pStyle w:val="Heading2"/>
-        <w:spacing w:after="180" w:before="360"/>
-        <w:ind/>
+        <w:spacing w:after="200" w:before="400"/>
       </w:pPr>
       <w:r>
         <w:rPr>
           <w:rFonts w:ascii="SimHei" w:cs="SimHei" w:eastAsia="SimHei" w:hAnsi="SimHei"/>
           <w:b/>
           <w:bCs/>
-          <w:sz w:val="28"/>
-          <w:szCs w:val="28"/>
+          <w:color w:val="000000"/>
+          <w:sz w:val="30"/>
+          <w:szCs w:val="30"/>
         </w:rPr>
         <w:t xml:space="preserve">4.2  极值问题（Extremum）</w:t>
       </w:r>
@@ -1662,7 +1756,7 @@
     <w:next w:val="Normal"/>
     <w:qFormat/>
     <w:pPr>
-      <w:spacing w:after="180" w:before="360"/>
+      <w:spacing w:after="200" w:before="400"/>
       <w:outlineLvl w:val="1"/>
     </w:pPr>
     <w:rPr>
@@ -1670,8 +1764,8 @@
       <w:b/>
       <w:bCs/>
       <w:color w:val="000000"/>
-      <w:sz w:val="28"/>
-      <w:szCs w:val="28"/>
+      <w:sz w:val="30"/>
+      <w:szCs w:val="30"/>
     </w:rPr>
   </w:style>
 </w:styles>

</xml_diff>